<commit_message>
Replace 'at or below chance' with chance-level wording now that the benchmark C is 0.52 (0.50 is the no-information value); archive the original R 4.3.3/rms 6.8-1 sessionInfo and performance CSV under environment-specific names and cite those instead of the overwritten sessionInfo.txt
</commit_message>
<xml_diff>
--- a/PAPER.docx
+++ b/PAPER.docx
@@ -1903,7 +1903,7 @@
         <w:t xml:space="preserve">results/base_paper_replication/</w:t>
       </w:r>
       <w:r>
-        <w:t xml:space="preserve">) — at or below chance — underscoring that apparent-performance figures reported without leakage control routinely fail to generalise, and framing our own honest 0.61 as a meaningful improvement over that benchmark. It nonetheless validated in</w:t>
+        <w:t xml:space="preserve">) — essentially chance-level discrimination — underscoring that apparent-performance figures reported without leakage control routinely fail to generalise, and framing our own honest 0.61 as a meaningful improvement over that benchmark. It nonetheless validated in</w:t>
       </w:r>
       <w:r>
         <w:t xml:space="preserve"> </w:t>
@@ -2615,7 +2615,7 @@
         <w:t xml:space="preserve"> </w:t>
       </w:r>
       <w:r>
-        <w:t xml:space="preserve">6.8-1; see</w:t>
+        <w:t xml:space="preserve">6.8-1; archived as</w:t>
       </w:r>
       <w:r>
         <w:t xml:space="preserve"> </w:t>
@@ -2624,7 +2624,7 @@
         <w:rPr>
           <w:rStyle w:val="VerbatimChar"/>
         </w:rPr>
-        <w:t xml:space="preserve">results/base_paper_replication/sessionInfo.txt</w:t>
+        <w:t xml:space="preserve">results/base_paper_replication/sessionInfo_rms6.8-1_R4.3.3.txt</w:t>
       </w:r>
       <w:r>
         <w:t xml:space="preserve">) was 0.48, and re-running the same script and seed under R 4.5.3 with</w:t>
@@ -2642,7 +2642,19 @@
         <w:t xml:space="preserve"> </w:t>
       </w:r>
       <w:r>
-        <w:t xml:space="preserve">8.1-1 gives 0.52. Both estimates are at or below chance level and the apparent C (0.54) is identical in both, so the conclusion is unchanged. That a prior signature fails to replicate under honest evaluation, while ours reaches a modest but real C = 0.61, underscores that the difference between the two is methodological rigor, not cohort luck.</w:t>
+        <w:t xml:space="preserve">8.1-1 gives 0.52 (current</w:t>
+      </w:r>
+      <w:r>
+        <w:t xml:space="preserve"> </w:t>
+      </w:r>
+      <w:r>
+        <w:rPr>
+          <w:rStyle w:val="VerbatimChar"/>
+        </w:rPr>
+        <w:t xml:space="preserve">sessionInfo.txt</w:t>
+      </w:r>
+      <w:r>
+        <w:t xml:space="preserve">). Both estimates are at chance level — 0.50 is the no-information value — and the apparent C (0.54) is identical in both, so the conclusion is unchanged. That a prior signature fails to replicate under honest evaluation, while ours reaches a modest but real C = 0.61, underscores that the difference between the two is methodological rigor, not cohort luck.</w:t>
       </w:r>
     </w:p>
     <w:p>

</xml_diff>